<commit_message>
Save latest main.py and generic template changes
</commit_message>
<xml_diff>
--- a/templates/professional_report_template.docx
+++ b/templates/professional_report_template.docx
@@ -269,39 +269,7 @@
     <w:p>
       <w:pPr>
         <w:spacing w:line="360" w:lineRule="auto"/>
-        <w:jc w:val="center"/>
-        <w:rPr>
-          <w:rFonts w:cs="Times New Roman"/>
-          <w:sz w:val="21"/>
-          <w:szCs w:val="21"/>
-        </w:rPr>
-      </w:pPr>
-    </w:p>
-    <w:p>
-      <w:pPr>
-        <w:spacing w:line="360" w:lineRule="auto"/>
-        <w:jc w:val="center"/>
-        <w:rPr>
-          <w:rFonts w:cs="Times New Roman"/>
-          <w:sz w:val="21"/>
-          <w:szCs w:val="21"/>
-        </w:rPr>
-      </w:pPr>
-    </w:p>
-    <w:p>
-      <w:pPr>
-        <w:spacing w:line="360" w:lineRule="auto"/>
-        <w:jc w:val="center"/>
-        <w:rPr>
-          <w:rFonts w:cs="Times New Roman"/>
-          <w:sz w:val="21"/>
-          <w:szCs w:val="21"/>
-        </w:rPr>
-      </w:pPr>
-    </w:p>
-    <w:p>
-      <w:pPr>
-        <w:spacing w:line="360" w:lineRule="auto"/>
+        <w:ind w:firstLine="0"/>
         <w:jc w:val="left"/>
         <w:rPr>
           <w:rFonts w:cs="Times New Roman"/>
@@ -321,6 +289,7 @@
     <w:p>
       <w:pPr>
         <w:spacing w:line="360" w:lineRule="auto"/>
+        <w:ind w:firstLine="0"/>
         <w:jc w:val="center"/>
         <w:rPr>
           <w:rFonts w:cs="Times New Roman"/>
@@ -374,146 +343,7 @@
     <w:p>
       <w:pPr>
         <w:spacing w:line="360" w:lineRule="auto"/>
-        <w:rPr>
-          <w:rFonts w:cs="Times New Roman"/>
-          <w:sz w:val="21"/>
-          <w:szCs w:val="21"/>
-        </w:rPr>
-      </w:pPr>
-    </w:p>
-    <w:p>
-      <w:pPr>
-        <w:spacing w:line="360" w:lineRule="auto"/>
-        <w:rPr>
-          <w:rFonts w:cs="Times New Roman"/>
-          <w:sz w:val="21"/>
-          <w:szCs w:val="21"/>
-        </w:rPr>
-      </w:pPr>
-    </w:p>
-    <w:p>
-      <w:pPr>
-        <w:spacing w:line="360" w:lineRule="auto"/>
-        <w:rPr>
-          <w:rFonts w:cs="Times New Roman"/>
-          <w:sz w:val="21"/>
-          <w:szCs w:val="21"/>
-        </w:rPr>
-      </w:pPr>
-    </w:p>
-    <w:p>
-      <w:pPr>
-        <w:spacing w:line="360" w:lineRule="auto"/>
-        <w:rPr>
-          <w:rFonts w:cs="Times New Roman"/>
-          <w:sz w:val="21"/>
-          <w:szCs w:val="21"/>
-        </w:rPr>
-      </w:pPr>
-    </w:p>
-    <w:p>
-      <w:pPr>
-        <w:spacing w:line="360" w:lineRule="auto"/>
-        <w:rPr>
-          <w:rFonts w:cs="Times New Roman"/>
-          <w:sz w:val="21"/>
-          <w:szCs w:val="21"/>
-        </w:rPr>
-      </w:pPr>
-    </w:p>
-    <w:p>
-      <w:pPr>
-        <w:spacing w:line="360" w:lineRule="auto"/>
-        <w:rPr>
-          <w:rFonts w:cs="Times New Roman"/>
-          <w:sz w:val="21"/>
-          <w:szCs w:val="21"/>
-        </w:rPr>
-      </w:pPr>
-    </w:p>
-    <w:p>
-      <w:pPr>
-        <w:spacing w:line="360" w:lineRule="auto"/>
-        <w:rPr>
-          <w:rFonts w:cs="Times New Roman"/>
-          <w:sz w:val="21"/>
-          <w:szCs w:val="21"/>
-        </w:rPr>
-      </w:pPr>
-    </w:p>
-    <w:p>
-      <w:pPr>
-        <w:spacing w:line="360" w:lineRule="auto"/>
-        <w:rPr>
-          <w:rFonts w:cs="Times New Roman"/>
-          <w:sz w:val="21"/>
-          <w:szCs w:val="21"/>
-        </w:rPr>
-      </w:pPr>
-    </w:p>
-    <w:p>
-      <w:pPr>
-        <w:spacing w:line="360" w:lineRule="auto"/>
-        <w:rPr>
-          <w:rFonts w:cs="Times New Roman"/>
-          <w:sz w:val="21"/>
-          <w:szCs w:val="21"/>
-        </w:rPr>
-      </w:pPr>
-    </w:p>
-    <w:p>
-      <w:pPr>
-        <w:spacing w:line="360" w:lineRule="auto"/>
-        <w:rPr>
-          <w:rFonts w:cs="Times New Roman"/>
-          <w:sz w:val="21"/>
-          <w:szCs w:val="21"/>
-        </w:rPr>
-      </w:pPr>
-    </w:p>
-    <w:p>
-      <w:pPr>
-        <w:spacing w:line="360" w:lineRule="auto"/>
-        <w:rPr>
-          <w:rFonts w:cs="Times New Roman"/>
-          <w:sz w:val="21"/>
-          <w:szCs w:val="21"/>
-        </w:rPr>
-      </w:pPr>
-    </w:p>
-    <w:p>
-      <w:pPr>
-        <w:spacing w:line="360" w:lineRule="auto"/>
-        <w:rPr>
-          <w:rFonts w:cs="Times New Roman"/>
-          <w:sz w:val="21"/>
-          <w:szCs w:val="21"/>
-        </w:rPr>
-      </w:pPr>
-    </w:p>
-    <w:p>
-      <w:pPr>
-        <w:spacing w:line="360" w:lineRule="auto"/>
-        <w:rPr>
-          <w:rFonts w:cs="Times New Roman"/>
-          <w:sz w:val="21"/>
-          <w:szCs w:val="21"/>
-        </w:rPr>
-      </w:pPr>
-    </w:p>
-    <w:p>
-      <w:pPr>
-        <w:spacing w:line="360" w:lineRule="auto"/>
-        <w:rPr>
-          <w:rFonts w:cs="Times New Roman"/>
-          <w:sz w:val="21"/>
-          <w:szCs w:val="21"/>
-        </w:rPr>
-      </w:pPr>
-    </w:p>
-    <w:p>
-      <w:pPr>
-        <w:spacing w:line="360" w:lineRule="auto"/>
+        <w:ind w:firstLine="0"/>
         <w:rPr>
           <w:rFonts w:cs="Times New Roman"/>
           <w:sz w:val="21"/>
@@ -531,6 +361,7 @@
     <w:p>
       <w:pPr>
         <w:spacing w:line="360" w:lineRule="auto"/>
+        <w:ind w:firstLine="0"/>
         <w:jc w:val="center"/>
         <w:rPr>
           <w:rFonts w:cs="Times New Roman"/>
@@ -551,64 +382,6 @@
         <w:lastRenderedPageBreak/>
         <w:t>ÍNDICE DE TABLAS</w:t>
       </w:r>
-    </w:p>
-    <w:p>
-      <w:pPr>
-        <w:spacing w:line="360" w:lineRule="auto"/>
-        <w:rPr>
-          <w:rFonts w:cs="Times New Roman"/>
-          <w:sz w:val="21"/>
-          <w:szCs w:val="21"/>
-        </w:rPr>
-      </w:pPr>
-    </w:p>
-    <w:p>
-      <w:pPr>
-        <w:spacing w:line="360" w:lineRule="auto"/>
-        <w:rPr>
-          <w:rFonts w:cs="Times New Roman"/>
-          <w:sz w:val="21"/>
-          <w:szCs w:val="21"/>
-        </w:rPr>
-      </w:pPr>
-      <w:r>
-        <w:rPr>
-          <w:rFonts w:cs="Times New Roman"/>
-          <w:sz w:val="21"/>
-          <w:szCs w:val="21"/>
-        </w:rPr>
-        <w:t>{{TABLE_INDEX}}</w:t>
-      </w:r>
-    </w:p>
-    <w:p>
-      <w:pPr>
-        <w:spacing w:line="360" w:lineRule="auto"/>
-        <w:rPr>
-          <w:rFonts w:cs="Times New Roman"/>
-          <w:sz w:val="21"/>
-          <w:szCs w:val="21"/>
-        </w:rPr>
-      </w:pPr>
-    </w:p>
-    <w:p>
-      <w:pPr>
-        <w:spacing w:line="360" w:lineRule="auto"/>
-        <w:rPr>
-          <w:rFonts w:cs="Times New Roman"/>
-          <w:sz w:val="21"/>
-          <w:szCs w:val="21"/>
-        </w:rPr>
-      </w:pPr>
-    </w:p>
-    <w:p>
-      <w:pPr>
-        <w:spacing w:line="360" w:lineRule="auto"/>
-        <w:rPr>
-          <w:rFonts w:cs="Times New Roman"/>
-          <w:sz w:val="21"/>
-          <w:szCs w:val="21"/>
-        </w:rPr>
-      </w:pPr>
     </w:p>
     <w:p>
       <w:pPr>
@@ -636,10 +409,19 @@
           <w:docGrid w:linePitch="360"/>
         </w:sectPr>
       </w:pPr>
-    </w:p>
-    <w:p>
-      <w:pPr>
-        <w:spacing w:line="360" w:lineRule="auto"/>
+      <w:r>
+        <w:rPr>
+          <w:rFonts w:cs="Times New Roman"/>
+          <w:sz w:val="21"/>
+          <w:szCs w:val="21"/>
+        </w:rPr>
+        <w:t>{{TABLE_INDEX}}</w:t>
+      </w:r>
+    </w:p>
+    <w:p>
+      <w:pPr>
+        <w:spacing w:line="360" w:lineRule="auto"/>
+        <w:ind w:firstLine="0"/>
         <w:jc w:val="center"/>
         <w:rPr>
           <w:rFonts w:cs="Times New Roman"/>
@@ -684,12 +466,13 @@
           <w:sz w:val="21"/>
           <w:szCs w:val="21"/>
         </w:rPr>
-        <w:t>{{FIGURE_INDEX}}</w:t>
-      </w:r>
-    </w:p>
-    <w:p>
-      <w:pPr>
-        <w:spacing w:line="360" w:lineRule="auto"/>
+        <w:t>{{FIGURE_INDEX}</w:t>
+      </w:r>
+    </w:p>
+    <w:p>
+      <w:pPr>
+        <w:spacing w:line="360" w:lineRule="auto"/>
+        <w:ind w:firstLine="0"/>
         <w:rPr>
           <w:rFonts w:cs="Times New Roman"/>
           <w:sz w:val="21"/>

</xml_diff>